<commit_message>
Fleet Reference: update stale CrowdStrike gap counts (125 → 88)
Master sheet audit for Scenario A revealed:
- 52 win_laptops in SN without CS agent — unchanged ✓
- "Additional Windows in CS but NOT in SN" was 125, actual is 88
- Scenario E same metric updated: 125 → 88
- §7 build note updated: "45 Windows gap applied" → "88 Windows in CS not in SN CMDB"

Co-Authored-By: Claude Sonnet 4.6 <noreply@anthropic.com>
</commit_message>
<xml_diff>
--- a/docs/Luminary_Fleet_Environment_Reference.docx
+++ b/docs/Luminary_Fleet_Environment_Reference.docx
@@ -4062,7 +4062,7 @@
                 <w:rFonts w:ascii="Calibri" w:hAnsi="Calibri"/>
                 <w:sz w:val="18"/>
               </w:rPr>
-              <w:t>125</w:t>
+              <w:t>88</w:t>
             </w:r>
           </w:p>
         </w:tc>
@@ -4855,7 +4855,7 @@
                 <w:rFonts w:ascii="Calibri" w:hAnsi="Calibri"/>
                 <w:sz w:val="18"/>
               </w:rPr>
-              <w:t>125</w:t>
+              <w:t>88</w:t>
             </w:r>
           </w:p>
         </w:tc>
@@ -6041,7 +6041,7 @@
                 <w:rFonts w:ascii="Calibri" w:hAnsi="Calibri"/>
                 <w:sz w:val="18"/>
               </w:rPr>
-              <w:t>45 Windows gap applied in v9 sheet</w:t>
+              <w:t>88 Windows in CS not in SN CMDB</w:t>
             </w:r>
           </w:p>
         </w:tc>

</xml_diff>

<commit_message>
Scenario B: update IoT VLAN mismatch count 22→11, site SFO only
11 SFO Ordr-only devices (was 22 across SFO/NYC/LON).
Fixed collateral over-replacements: Scenario C/D sites, ~22% CMDB underreport
rate, §6 network table WAP counts for NYC/LON/SGP restored to 22.
Pending enhancement note marked as implemented (2026-07-06).

Co-Authored-By: Claude Sonnet 4.6 <noreply@anthropic.com>
</commit_message>
<xml_diff>
--- a/docs/Luminary_Fleet_Environment_Reference.docx
+++ b/docs/Luminary_Fleet_Environment_Reference.docx
@@ -4123,7 +4123,7 @@
           <w:color w:val="333333"/>
           <w:sz w:val="20"/>
         </w:rPr>
-        <w:t>22 IoT devices detected by Ordr are on the wrong VLAN. They appear on corporate VLAN 10 or 20 instead of the isolated IoT VLAN 40. Lateral movement risk: if any of these devices is compromised, it has direct access to corporate endpoints.</w:t>
+        <w:t>11 IoT devices detected by Ordr are on the wrong VLAN. They appear on corporate VLAN 10 or 20 instead of the isolated IoT VLAN 40. Lateral movement risk: if any of these devices is compromised, it has direct access to corporate endpoints.</w:t>
       </w:r>
     </w:p>
     <w:tbl>
@@ -4229,7 +4229,7 @@
                 <w:rFonts w:ascii="Calibri" w:hAnsi="Calibri"/>
                 <w:sz w:val="18"/>
               </w:rPr>
-              <w:t>22</w:t>
+              <w:t>11</w:t>
             </w:r>
           </w:p>
         </w:tc>
@@ -4323,7 +4323,7 @@
                 <w:rFonts w:ascii="Calibri" w:hAnsi="Calibri"/>
                 <w:sz w:val="18"/>
               </w:rPr>
-              <w:t>SFO, NYC, LON</w:t>
+              <w:t>SFO</w:t>
             </w:r>
           </w:p>
         </w:tc>
@@ -4778,7 +4778,6 @@
           <w:color w:val="333333"/>
           <w:sz w:val="20"/>
         </w:rPr>
-        <w:lastRenderedPageBreak/>
         <w:t>The headline gap story: 182 endpoints are enrolled in CrowdStrike, Jamf, or Intune but do not exist in ServiceNow. The CMDB underreports managed devices by ~22%. UAI surfaces these as "found by endpoint tools, missing from CMDB."</w:t>
       </w:r>
     </w:p>
@@ -6820,7 +6819,7 @@
           <w:color w:val="333333"/>
           <w:sz w:val="20"/>
         </w:rPr>
-        <w:t>Scenario B (VLAN mismatch): add vlan/expected_vlan fields to Ordr seed data; flag 22 IoT devices — designed, not yet implemented in generator</w:t>
+        <w:t>Scenario B (VLAN mismatch): add vlan/expected_vlan fields to Ordr seed data; flag 11 IoT devices — implemented 2026-07-06 (11 SFO Ordr-only devices)</w:t>
       </w:r>
     </w:p>
     <w:p>

</xml_diff>

<commit_message>
Reduce Ordr IoT count to match UAI-observed 77 (48 cameras + 15 sensors + 14 medical)
Master sheet: removed ordr from 166 excess IoT/clinic rows (ordr total 829→663).
All 11 SFO VLAN-mismatch devices preserved.
Docs updated: Ordr total 829→663, IoT/OT 245→63, Clinical 17→14, Scenario B total 245→63.

Co-Authored-By: Claude Sonnet 4.6 <noreply@anthropic.com>
</commit_message>
<xml_diff>
--- a/docs/Luminary_Fleet_Environment_Reference.docx
+++ b/docs/Luminary_Fleet_Environment_Reference.docx
@@ -1221,7 +1221,7 @@
                 <w:rFonts w:ascii="Calibri" w:hAnsi="Calibri"/>
                 <w:sz w:val="18"/>
               </w:rPr>
-              <w:t>829</w:t>
+              <w:t>663</w:t>
             </w:r>
           </w:p>
         </w:tc>
@@ -3434,7 +3434,7 @@
                 <w:rFonts w:ascii="Calibri" w:hAnsi="Calibri"/>
                 <w:sz w:val="18"/>
               </w:rPr>
-              <w:t>245</w:t>
+              <w:t>63</w:t>
             </w:r>
           </w:p>
         </w:tc>
@@ -3494,7 +3494,7 @@
                 <w:rFonts w:ascii="Calibri" w:hAnsi="Calibri"/>
                 <w:sz w:val="18"/>
               </w:rPr>
-              <w:t>17</w:t>
+              <w:t>14</w:t>
             </w:r>
           </w:p>
         </w:tc>
@@ -4199,7 +4199,7 @@
                 <w:rFonts w:ascii="Calibri" w:hAnsi="Calibri"/>
                 <w:sz w:val="18"/>
               </w:rPr>
-              <w:t>245</w:t>
+              <w:t>63</w:t>
             </w:r>
           </w:p>
         </w:tc>
@@ -4329,6 +4329,70 @@
         </w:tc>
       </w:tr>
     </w:tbl>
+    <w:p>
+      <w:pPr>
+        <w:pStyle w:val="Heading3"/>
+      </w:pPr>
+      <w:r>
+        <w:t xml:space="preserve">How to Find This in UAI (Scenario B Demo Steps)</w:t>
+      </w:r>
+    </w:p>
+    <w:p>
+      <w:pPr>
+        <w:pStyle w:val="Normal"/>
+      </w:pPr>
+      <w:r>
+        <w:t xml:space="preserve">1. Open UAI → Asset Inventory. Set Source filter = Ordr.</w:t>
+      </w:r>
+    </w:p>
+    <w:p>
+      <w:pPr>
+        <w:pStyle w:val="Normal"/>
+      </w:pPr>
+      <w:r>
+        <w:t xml:space="preserve">2. Add the VLAN / Network column. Sort by VLAN ascending.</w:t>
+      </w:r>
+    </w:p>
+    <w:p>
+      <w:pPr>
+        <w:pStyle w:val="Normal"/>
+      </w:pPr>
+      <w:r>
+        <w:t xml:space="preserve">3. Observe: the bulk of IoT devices show VLAN 40 (IoT). Eleven SFO devices show VLAN 10 (Corp) or VLAN 20 (Guest).</w:t>
+      </w:r>
+    </w:p>
+    <w:p>
+      <w:pPr>
+        <w:pStyle w:val="Normal"/>
+      </w:pPr>
+      <w:r>
+        <w:t xml:space="preserve">4. Click any mismatch device — confirm Device Type = IP Camera or IoT Sensor. Ordr classified it correctly as IoT, but it landed on the wrong VLAN.</w:t>
+      </w:r>
+    </w:p>
+    <w:p>
+      <w:pPr>
+        <w:pStyle w:val="Normal"/>
+      </w:pPr>
+      <w:r>
+        <w:t xml:space="preserve">5. The risk: these cameras and sensors have Layer-2 access to corporate endpoints (VLAN 10) or are exposed to guest traffic (VLAN 20). A compromised camera is a lateral-movement path into the corporate network.</w:t>
+      </w:r>
+    </w:p>
+    <w:p>
+      <w:pPr>
+        <w:pStyle w:val="Normal"/>
+      </w:pPr>
+      <w:r>
+        <w:t xml:space="preserve">SE talking point: "Ordr sees 245 IoT devices. 11 of them in SFO are on the corporate or guest VLAN instead of the isolated IoT VLAN. UAI surfaces this in seconds — your network team would need a full manual VLAN audit to find the same thing, and they probably haven't done one."</w:t>
+      </w:r>
+    </w:p>
+    <w:p>
+      <w:pPr>
+        <w:pStyle w:val="Normal"/>
+      </w:pPr>
+      <w:r>
+        <w:t xml:space="preserve">Highlight devices: lsys-sfo-iot-2002, 2019, 2079, 2120, 2135, 2138, 2173, 2176, 2177, 2194, 2206 (all SFO, Ordr-only, IP Cameras / Sensors / MV12W).</w:t>
+      </w:r>
+    </w:p>
     <w:p>
       <w:pPr>
         <w:spacing w:before="160" w:after="40"/>
@@ -6371,7 +6435,7 @@
                 <w:rFonts w:ascii="Calibri" w:hAnsi="Calibri"/>
                 <w:sz w:val="18"/>
               </w:rPr>
-              <w:t>829</w:t>
+              <w:t>663</w:t>
             </w:r>
           </w:p>
         </w:tc>

</xml_diff>

<commit_message>
Ordr → medical devices only: 30 clinical devices, all Ordr-exclusive
Removed ordr from 649 non-clinic rows (workstations, laptops, mobile, cameras,
sensors, printers). Added 13 new clinic rows (AMS 2, BLR+3, LON+2, NYC+1, SFO+3,
SGP+2) for 30 total. All 30 are ordr-only seen_by.
Docs updated: Ordr 663→30, IoT/OT 63→0, Clinical 14→30.

Co-Authored-By: Claude Sonnet 4.6 <noreply@anthropic.com>
</commit_message>
<xml_diff>
--- a/docs/Luminary_Fleet_Environment_Reference.docx
+++ b/docs/Luminary_Fleet_Environment_Reference.docx
@@ -1221,7 +1221,7 @@
                 <w:rFonts w:ascii="Calibri" w:hAnsi="Calibri"/>
                 <w:sz w:val="18"/>
               </w:rPr>
-              <w:t>663</w:t>
+              <w:t>30</w:t>
             </w:r>
           </w:p>
         </w:tc>
@@ -3434,7 +3434,7 @@
                 <w:rFonts w:ascii="Calibri" w:hAnsi="Calibri"/>
                 <w:sz w:val="18"/>
               </w:rPr>
-              <w:t>63</w:t>
+              <w:t>0</w:t>
             </w:r>
           </w:p>
         </w:tc>
@@ -3494,7 +3494,7 @@
                 <w:rFonts w:ascii="Calibri" w:hAnsi="Calibri"/>
                 <w:sz w:val="18"/>
               </w:rPr>
-              <w:t>14</w:t>
+              <w:t>30</w:t>
             </w:r>
           </w:p>
         </w:tc>
@@ -4199,7 +4199,7 @@
                 <w:rFonts w:ascii="Calibri" w:hAnsi="Calibri"/>
                 <w:sz w:val="18"/>
               </w:rPr>
-              <w:t>63</w:t>
+              <w:t>30</w:t>
             </w:r>
           </w:p>
         </w:tc>
@@ -6435,7 +6435,7 @@
                 <w:rFonts w:ascii="Calibri" w:hAnsi="Calibri"/>
                 <w:sz w:val="18"/>
               </w:rPr>
-              <w:t>663</w:t>
+              <w:t>30</w:t>
             </w:r>
           </w:p>
         </w:tc>

</xml_diff>

<commit_message>
Update all vendor counts + total unique assets to 2,403 (2026-07-07)
Provider count updates: Meraki 1,177; Mist 745; Tenable 1,580;
Dataset Final ServiceNow corrected to 1,415.
Total unique assets updated: 2,390 → 2,403 across all three docs.
UAI location field sources section added (2026-07-05).
uai-discovery-scope.md: Mist floor maps now ✅ (15 maps, City - Floor format).

Co-Authored-By: Claude Sonnet 4.6 <noreply@anthropic.com>
</commit_message>
<xml_diff>
--- a/docs/Luminary_Fleet_Environment_Reference.docx
+++ b/docs/Luminary_Fleet_Environment_Reference.docx
@@ -1130,7 +1130,7 @@
                 <w:rFonts w:ascii="Calibri" w:hAnsi="Calibri"/>
                 <w:sz w:val="18"/>
               </w:rPr>
-              <w:t>1,186</w:t>
+              <w:t>1,177</w:t>
             </w:r>
           </w:p>
         </w:tc>
@@ -1175,7 +1175,7 @@
                 <w:rFonts w:ascii="Calibri" w:hAnsi="Calibri"/>
                 <w:sz w:val="18"/>
               </w:rPr>
-              <w:t>750</w:t>
+              <w:t>745</w:t>
             </w:r>
           </w:p>
         </w:tc>
@@ -1266,7 +1266,7 @@
                 <w:rFonts w:ascii="Calibri" w:hAnsi="Calibri"/>
                 <w:sz w:val="18"/>
               </w:rPr>
-              <w:t>1,587</w:t>
+              <w:t>1,580</w:t>
             </w:r>
           </w:p>
         </w:tc>
@@ -3840,8 +3840,7 @@
           <w:color w:val="333333"/>
           <w:sz w:val="20"/>
         </w:rPr>
-        <w:lastRenderedPageBreak/>
-        <w:t>Demo talking point: "ServiceNow told us we have 1,415 assets. UAI found 2,390. The 975 we did not know about include 245 IoT devices, 505 mobile devices, and 182 endpoints that your security tools manage but your CMDB has never seen."</w:t>
+        <w:t>Demo talking point: "ServiceNow told us we have 1,415 assets. UAI found 2,403. The 975 we did not know about include 245 IoT devices, 505 mobile devices, and 182 endpoints that your security tools manage but your CMDB has never seen."</w:t>
       </w:r>
     </w:p>
     <w:p>
@@ -6285,7 +6284,7 @@
                 <w:rFonts w:ascii="Calibri" w:hAnsi="Calibri"/>
                 <w:sz w:val="18"/>
               </w:rPr>
-              <w:t>1,186</w:t>
+              <w:t>1,177</w:t>
             </w:r>
           </w:p>
         </w:tc>
@@ -6360,7 +6359,7 @@
                 <w:rFonts w:ascii="Calibri" w:hAnsi="Calibri"/>
                 <w:sz w:val="18"/>
               </w:rPr>
-              <w:t>750</w:t>
+              <w:t>745</w:t>
             </w:r>
           </w:p>
         </w:tc>
@@ -6402,7 +6401,7 @@
                 <w:rFonts w:ascii="Calibri" w:hAnsi="Calibri"/>
                 <w:sz w:val="18"/>
               </w:rPr>
-              <w:t>Wireless clients</w:t>
+              <w:t>Wireless clients; floor maps enabled — devices show 'Bangalore - 4th Floor' location format</w:t>
             </w:r>
           </w:p>
         </w:tc>
@@ -6510,7 +6509,7 @@
                 <w:rFonts w:ascii="Calibri" w:hAnsi="Calibri"/>
                 <w:sz w:val="18"/>
               </w:rPr>
-              <w:t>1,587</w:t>
+              <w:t>1,580</w:t>
             </w:r>
           </w:p>
         </w:tc>
@@ -6759,7 +6758,7 @@
           <w:color w:val="333333"/>
           <w:sz w:val="20"/>
         </w:rPr>
-        <w:t>Version: v9 (July 2026) — 2,390 rows across all asset categories</w:t>
+        <w:t>Version: v9 (July 2026) — 2,403 rows across all asset categories</w:t>
       </w:r>
     </w:p>
     <w:p>
@@ -6788,6 +6787,11 @@
           <w:sz w:val="20"/>
         </w:rPr>
         <w:t>Repo: github.com/rrepswal/luminary-demo-docs (auto-deploys on push to main)</w:t>
+      </w:r>
+    </w:p>
+    <w:p>
+      <w:r>
+        <w:t>UAI Location Field Sources (as of 2026-07-05)</w:t>
       </w:r>
     </w:p>
     <w:p>
@@ -6952,6 +6956,64 @@
           <w:sz w:val="20"/>
         </w:rPr>
         <w:t>If any demo script, slide deck, or storyline doc ever disagrees with this reference about what is demoable, THIS document wins. Update the deck — not the data.</w:t>
+      </w:r>
+    </w:p>
+    <w:p>
+      <w:r>
+        <w:t xml:space="preserve"/>
+      </w:r>
+    </w:p>
+    <w:p>
+      <w:r>
+        <w:rPr>
+          <w:b/>
+        </w:rPr>
+        <w:t xml:space="preserve">9. UAI Location Field Sources (updated 2026-07-05)</w:t>
+      </w:r>
+    </w:p>
+    <w:p>
+      <w:pPr>
+        <w:pStyle w:val="ListBullet"/>
+      </w:pPr>
+      <w:r>
+        <w:t xml:space="preserve">CrowdStrike: reads zone_group field → city name (e.g. San Francisco, London)</w:t>
+      </w:r>
+    </w:p>
+    <w:p>
+      <w:pPr>
+        <w:pStyle w:val="ListBullet"/>
+      </w:pPr>
+      <w:r>
+        <w:t xml:space="preserve">ServiceNow: reads u_region from linked cmn_location record → city name</w:t>
+      </w:r>
+    </w:p>
+    <w:p>
+      <w:pPr>
+        <w:pStyle w:val="ListBullet"/>
+      </w:pPr>
+      <w:r>
+        <w:t xml:space="preserve">Jamf Pro: reads userAndLocation.building field → city name (buildingId / departmentId / department fields are empty)</w:t>
+      </w:r>
+    </w:p>
+    <w:p>
+      <w:pPr>
+        <w:pStyle w:val="ListBullet"/>
+      </w:pPr>
+      <w:r>
+        <w:t xml:space="preserve">Mist: reads map name from /sites/{id}/maps when map_id set on device → floor location (e.g. 'Bangalore - 4th Floor')</w:t>
+      </w:r>
+    </w:p>
+    <w:p>
+      <w:pPr>
+        <w:pStyle w:val="ListBullet"/>
+      </w:pPr>
+      <w:r>
+        <w:t xml:space="preserve">Meraki: geocodes device lat/lng coordinates → city name (e.g. San Francisco, New York, London)</w:t>
+      </w:r>
+    </w:p>
+    <w:p>
+      <w:r>
+        <w:t xml:space="preserve"/>
       </w:r>
     </w:p>
     <w:sectPr>

</xml_diff>

<commit_message>
Remove IoT devices from Tenable seen_by; update Tenable count 1580→1425
IoT-category rows (155 with tenable in seen_by) stripped from master sheet.
All three reference docs updated: Fleet Reference, SE Overview, Dataset Final.

Co-Authored-By: Claude Sonnet 4.6 <noreply@anthropic.com>
</commit_message>
<xml_diff>
--- a/docs/Luminary_Fleet_Environment_Reference.docx
+++ b/docs/Luminary_Fleet_Environment_Reference.docx
@@ -1266,7 +1266,7 @@
                 <w:rFonts w:ascii="Calibri" w:hAnsi="Calibri"/>
                 <w:sz w:val="18"/>
               </w:rPr>
-              <w:t>1,580</w:t>
+              <w:t>1,425</w:t>
             </w:r>
           </w:p>
         </w:tc>
@@ -6509,7 +6509,7 @@
                 <w:rFonts w:ascii="Calibri" w:hAnsi="Calibri"/>
                 <w:sz w:val="18"/>
               </w:rPr>
-              <w:t>1,580</w:t>
+              <w:t>1,425</w:t>
             </w:r>
           </w:p>
         </w:tc>

</xml_diff>

<commit_message>
Add 9 clinic devices; Ordr 30→39; VLAN table + Scenario B updated
Master sheet: 9 new clinic rows (AMS+3, LON+2, BLR+2, SGP+1, NYC+1).
Fleet Reference: 9-column VLAN table, Scenario B rewritten for Medical
Device Guest VLAN mismatch, Meraki/Mist/Ordr counts updated.

Co-Authored-By: Claude Sonnet 4.6 <noreply@anthropic.com>
</commit_message>
<xml_diff>
--- a/docs/Luminary_Fleet_Environment_Reference.docx
+++ b/docs/Luminary_Fleet_Environment_Reference.docx
@@ -1130,7 +1130,7 @@
                 <w:rFonts w:ascii="Calibri" w:hAnsi="Calibri"/>
                 <w:sz w:val="18"/>
               </w:rPr>
-              <w:t>1,177</w:t>
+              <w:t>1,047</w:t>
             </w:r>
           </w:p>
         </w:tc>
@@ -1145,7 +1145,7 @@
                 <w:rFonts w:ascii="Calibri" w:hAnsi="Calibri"/>
                 <w:sz w:val="18"/>
               </w:rPr>
-              <w:t>Wireless clients, SFO/NYC/LON</w:t>
+              <w:t>Wireless clients + network devices, SFO/NYC/LON</w:t>
             </w:r>
           </w:p>
         </w:tc>
@@ -1175,7 +1175,7 @@
                 <w:rFonts w:ascii="Calibri" w:hAnsi="Calibri"/>
                 <w:sz w:val="18"/>
               </w:rPr>
-              <w:t>745</w:t>
+              <w:t>665</w:t>
             </w:r>
           </w:p>
         </w:tc>
@@ -1221,7 +1221,7 @@
                 <w:rFonts w:ascii="Calibri" w:hAnsi="Calibri"/>
                 <w:sz w:val="18"/>
               </w:rPr>
-              <w:t>30</w:t>
+              <w:t>39</w:t>
             </w:r>
           </w:p>
         </w:tc>
@@ -1236,7 +1236,7 @@
                 <w:rFonts w:ascii="Calibri" w:hAnsi="Calibri"/>
                 <w:sz w:val="18"/>
               </w:rPr>
-              <w:t>IoT + OT + clinic; VLAN mismatch scenario B</w:t>
+              <w:t>Medical Devices only; 9 on Guest VLAN (scenario B)</w:t>
             </w:r>
           </w:p>
         </w:tc>
@@ -3494,7 +3494,7 @@
                 <w:rFonts w:ascii="Calibri" w:hAnsi="Calibri"/>
                 <w:sz w:val="18"/>
               </w:rPr>
-              <w:t>30</w:t>
+              <w:t>39</w:t>
             </w:r>
           </w:p>
         </w:tc>
@@ -3522,7 +3522,7 @@
                 <w:rFonts w:ascii="Calibri" w:hAnsi="Calibri"/>
                 <w:sz w:val="18"/>
               </w:rPr>
-              <w:t>Clinic/lab equipment in SFO and BLR offices</w:t>
+              <w:t>Clinic/lab equipment across all 6 sites; 9 on Guest VLAN</w:t>
             </w:r>
           </w:p>
         </w:tc>
@@ -3794,7 +3794,7 @@
                 <w:rFonts w:ascii="Calibri" w:hAnsi="Calibri"/>
                 <w:sz w:val="18"/>
               </w:rPr>
-              <w:t>802</w:t>
+              <w:t>811</w:t>
             </w:r>
           </w:p>
         </w:tc>
@@ -4122,7 +4122,7 @@
           <w:color w:val="333333"/>
           <w:sz w:val="20"/>
         </w:rPr>
-        <w:t>11 IoT devices detected by Ordr are on the wrong VLAN. They appear on corporate VLAN 10 or 20 instead of the isolated IoT VLAN 40. Lateral movement risk: if any of these devices is compromised, it has direct access to corporate endpoints.</w:t>
+        <w:t>9 Medical Devices detected by Ordr are on the Guest VLAN (VLAN 20) instead of the isolated Clinical VLAN (VLAN 70). These are FDA Class II devices with PHI — placing them on Guest gives untrusted network guests Layer-2 access to patient-connected equipment.</w:t>
       </w:r>
     </w:p>
     <w:tbl>
@@ -4183,7 +4183,7 @@
                 <w:rFonts w:ascii="Calibri" w:hAnsi="Calibri"/>
                 <w:sz w:val="18"/>
               </w:rPr>
-              <w:t>Total IoT devices (Ordr)</w:t>
+              <w:t>Total Medical Devices (Ordr)</w:t>
             </w:r>
           </w:p>
         </w:tc>
@@ -4198,7 +4198,7 @@
                 <w:rFonts w:ascii="Calibri" w:hAnsi="Calibri"/>
                 <w:sz w:val="18"/>
               </w:rPr>
-              <w:t>30</w:t>
+              <w:t>39</w:t>
             </w:r>
           </w:p>
         </w:tc>
@@ -4214,7 +4214,7 @@
                 <w:rFonts w:ascii="Calibri" w:hAnsi="Calibri"/>
                 <w:sz w:val="18"/>
               </w:rPr>
-              <w:t>IoT devices on wrong VLAN</w:t>
+              <w:t>Medical Devices on Guest VLAN</w:t>
             </w:r>
           </w:p>
         </w:tc>
@@ -4228,7 +4228,7 @@
                 <w:rFonts w:ascii="Calibri" w:hAnsi="Calibri"/>
                 <w:sz w:val="18"/>
               </w:rPr>
-              <w:t>11</w:t>
+              <w:t>9</w:t>
             </w:r>
           </w:p>
         </w:tc>
@@ -4260,7 +4260,7 @@
                 <w:rFonts w:ascii="Calibri" w:hAnsi="Calibri"/>
                 <w:sz w:val="18"/>
               </w:rPr>
-              <w:t>VLAN 40 (IoT isolated)</w:t>
+              <w:t>VLAN 70 (Clinical)</w:t>
             </w:r>
           </w:p>
         </w:tc>
@@ -4290,7 +4290,7 @@
                 <w:rFonts w:ascii="Calibri" w:hAnsi="Calibri"/>
                 <w:sz w:val="18"/>
               </w:rPr>
-              <w:t>VLAN 10 (Corp) or VLAN 20 (Guest)</w:t>
+              <w:t>VLAN 20 (Guest)</w:t>
             </w:r>
           </w:p>
         </w:tc>
@@ -4322,7 +4322,7 @@
                 <w:rFonts w:ascii="Calibri" w:hAnsi="Calibri"/>
                 <w:sz w:val="18"/>
               </w:rPr>
-              <w:t>SFO</w:t>
+              <w:t>AMS, LON, BLR, SGP, NYC</w:t>
             </w:r>
           </w:p>
         </w:tc>
@@ -4381,7 +4381,7 @@
         <w:pStyle w:val="Normal"/>
       </w:pPr>
       <w:r>
-        <w:t xml:space="preserve">SE talking point: "Ordr sees 245 IoT devices. 11 of them in SFO are on the corporate or guest VLAN instead of the isolated IoT VLAN. UAI surfaces this in seconds — your network team would need a full manual VLAN audit to find the same thing, and they probably haven't done one."</w:t>
+        <w:t>Ordr sees 39 Medical Devices. 9 of them across AMS, LON, BLR, SGP, and NYC are on the Guest VLAN instead of the isolated Clinical VLAN. Guest Wi-Fi users have Layer-2 access to FDA Class II devices with PHI.</w:t>
       </w:r>
     </w:p>
     <w:p>
@@ -5077,135 +5077,162 @@
     <w:tbl>
       <w:tblPr>
         <w:tblStyle w:val="TableGrid"/>
-        <w:tblW w:w="0" w:type="auto"/>
-        <w:tblLook w:val="04A0" w:firstRow="1" w:lastRow="0" w:firstColumn="1" w:lastColumn="0" w:noHBand="0" w:noVBand="1"/>
+        <w:tblW w:type="auto" w:w="0"/>
+        <w:tblLook w:firstColumn="1" w:firstRow="1" w:lastColumn="0" w:lastRow="0" w:noHBand="0" w:noVBand="1" w:val="04A0"/>
       </w:tblPr>
       <w:tblGrid>
-        <w:gridCol w:w="1378"/>
-        <w:gridCol w:w="1378"/>
-        <w:gridCol w:w="1400"/>
-        <w:gridCol w:w="1378"/>
-        <w:gridCol w:w="1378"/>
-        <w:gridCol w:w="1378"/>
-        <w:gridCol w:w="1378"/>
+        <w:gridCol w:w="1072"/>
+        <w:gridCol w:w="1072"/>
+        <w:gridCol w:w="1072"/>
+        <w:gridCol w:w="1072"/>
+        <w:gridCol w:w="1072"/>
+        <w:gridCol w:w="1072"/>
+        <w:gridCol w:w="1072"/>
+        <w:gridCol w:w="1072"/>
+        <w:gridCol w:w="1072"/>
       </w:tblGrid>
       <w:tr>
         <w:tc>
           <w:tcPr>
-            <w:tcW w:w="1378" w:type="dxa"/>
-            <w:shd w:val="clear" w:color="auto" w:fill="005FB5"/>
-          </w:tcPr>
-          <w:p>
-            <w:r>
-              <w:rPr>
-                <w:rFonts w:ascii="Calibri" w:hAnsi="Calibri"/>
+            <w:tcW w:type="dxa" w:w="1072"/>
+            <w:shd w:val="clear" w:color="auto" w:fill="1F497D"/>
+          </w:tcPr>
+          <w:p>
+            <w:r>
+              <w:rPr>
                 <w:b/>
                 <w:color w:val="FFFFFF"/>
-                <w:sz w:val="18"/>
-              </w:rPr>
-              <w:t>Site</w:t>
-            </w:r>
-          </w:p>
-        </w:tc>
-        <w:tc>
-          <w:tcPr>
-            <w:tcW w:w="1378" w:type="dxa"/>
-            <w:shd w:val="clear" w:color="auto" w:fill="005FB5"/>
-          </w:tcPr>
-          <w:p>
-            <w:r>
-              <w:rPr>
-                <w:rFonts w:ascii="Calibri" w:hAnsi="Calibri"/>
+                <w:sz w:val="16"/>
+              </w:rPr>
+              <w:t>Seg</w:t>
+            </w:r>
+          </w:p>
+        </w:tc>
+        <w:tc>
+          <w:tcPr>
+            <w:tcW w:type="dxa" w:w="1072"/>
+            <w:shd w:val="clear" w:color="auto" w:fill="1F497D"/>
+          </w:tcPr>
+          <w:p>
+            <w:r>
+              <w:rPr>
                 <w:b/>
                 <w:color w:val="FFFFFF"/>
-                <w:sz w:val="18"/>
-              </w:rPr>
-              <w:t>IP Block</w:t>
-            </w:r>
-          </w:p>
-        </w:tc>
-        <w:tc>
-          <w:tcPr>
-            <w:tcW w:w="1378" w:type="dxa"/>
-            <w:shd w:val="clear" w:color="auto" w:fill="005FB5"/>
-          </w:tcPr>
-          <w:p>
-            <w:r>
-              <w:rPr>
-                <w:rFonts w:ascii="Calibri" w:hAnsi="Calibri"/>
+                <w:sz w:val="16"/>
+              </w:rPr>
+              <w:t>Name</w:t>
+            </w:r>
+          </w:p>
+        </w:tc>
+        <w:tc>
+          <w:tcPr>
+            <w:tcW w:type="dxa" w:w="1072"/>
+            <w:shd w:val="clear" w:color="auto" w:fill="1F497D"/>
+          </w:tcPr>
+          <w:p>
+            <w:r>
+              <w:rPr>
                 <w:b/>
                 <w:color w:val="FFFFFF"/>
-                <w:sz w:val="18"/>
-              </w:rPr>
-              <w:t>VLAN Design</w:t>
-            </w:r>
-          </w:p>
-        </w:tc>
-        <w:tc>
-          <w:tcPr>
-            <w:tcW w:w="1378" w:type="dxa"/>
-            <w:shd w:val="clear" w:color="auto" w:fill="005FB5"/>
-          </w:tcPr>
-          <w:p>
-            <w:r>
-              <w:rPr>
-                <w:rFonts w:ascii="Calibri" w:hAnsi="Calibri"/>
+                <w:sz w:val="16"/>
+              </w:rPr>
+              <w:t>Device Types</w:t>
+            </w:r>
+          </w:p>
+        </w:tc>
+        <w:tc>
+          <w:tcPr>
+            <w:tcW w:type="dxa" w:w="1072"/>
+            <w:shd w:val="clear" w:color="auto" w:fill="1F497D"/>
+          </w:tcPr>
+          <w:p>
+            <w:r>
+              <w:rPr>
                 <w:b/>
                 <w:color w:val="FFFFFF"/>
-                <w:sz w:val="18"/>
-              </w:rPr>
-              <w:t>WAPs</w:t>
-            </w:r>
-          </w:p>
-        </w:tc>
-        <w:tc>
-          <w:tcPr>
-            <w:tcW w:w="1378" w:type="dxa"/>
-            <w:shd w:val="clear" w:color="auto" w:fill="005FB5"/>
-          </w:tcPr>
-          <w:p>
-            <w:r>
-              <w:rPr>
-                <w:rFonts w:ascii="Calibri" w:hAnsi="Calibri"/>
+                <w:sz w:val="16"/>
+              </w:rPr>
+              <w:t>SFO (11)</w:t>
+            </w:r>
+          </w:p>
+        </w:tc>
+        <w:tc>
+          <w:tcPr>
+            <w:tcW w:type="dxa" w:w="1072"/>
+            <w:shd w:val="clear" w:color="auto" w:fill="1F497D"/>
+          </w:tcPr>
+          <w:p>
+            <w:r>
+              <w:rPr>
                 <w:b/>
                 <w:color w:val="FFFFFF"/>
-                <w:sz w:val="18"/>
-              </w:rPr>
-              <w:t>Swch</w:t>
-            </w:r>
-          </w:p>
-        </w:tc>
-        <w:tc>
-          <w:tcPr>
-            <w:tcW w:w="1378" w:type="dxa"/>
-            <w:shd w:val="clear" w:color="auto" w:fill="005FB5"/>
-          </w:tcPr>
-          <w:p>
-            <w:r>
-              <w:rPr>
-                <w:rFonts w:ascii="Calibri" w:hAnsi="Calibri"/>
+                <w:sz w:val="16"/>
+              </w:rPr>
+              <w:t>NYC (12)</w:t>
+            </w:r>
+          </w:p>
+        </w:tc>
+        <w:tc>
+          <w:tcPr>
+            <w:tcW w:type="dxa" w:w="1072"/>
+            <w:shd w:val="clear" w:color="auto" w:fill="1F497D"/>
+          </w:tcPr>
+          <w:p>
+            <w:r>
+              <w:rPr>
                 <w:b/>
                 <w:color w:val="FFFFFF"/>
-                <w:sz w:val="18"/>
-              </w:rPr>
-              <w:t>Rtrs</w:t>
-            </w:r>
-          </w:p>
-        </w:tc>
-        <w:tc>
-          <w:tcPr>
-            <w:tcW w:w="1378" w:type="dxa"/>
-            <w:shd w:val="clear" w:color="auto" w:fill="005FB5"/>
-          </w:tcPr>
-          <w:p>
-            <w:r>
-              <w:rPr>
-                <w:rFonts w:ascii="Calibri" w:hAnsi="Calibri"/>
+                <w:sz w:val="16"/>
+              </w:rPr>
+              <w:t>LON (13)</w:t>
+            </w:r>
+          </w:p>
+        </w:tc>
+        <w:tc>
+          <w:tcPr>
+            <w:tcW w:type="dxa" w:w="1072"/>
+            <w:shd w:val="clear" w:color="auto" w:fill="1F497D"/>
+          </w:tcPr>
+          <w:p>
+            <w:r>
+              <w:rPr>
                 <w:b/>
                 <w:color w:val="FFFFFF"/>
-                <w:sz w:val="18"/>
-              </w:rPr>
-              <w:t>Gap Subnet</w:t>
+                <w:sz w:val="16"/>
+              </w:rPr>
+              <w:t>AMS (14)</w:t>
+            </w:r>
+          </w:p>
+        </w:tc>
+        <w:tc>
+          <w:tcPr>
+            <w:tcW w:type="dxa" w:w="1072"/>
+            <w:shd w:val="clear" w:color="auto" w:fill="1F497D"/>
+          </w:tcPr>
+          <w:p>
+            <w:r>
+              <w:rPr>
+                <w:b/>
+                <w:color w:val="FFFFFF"/>
+                <w:sz w:val="16"/>
+              </w:rPr>
+              <w:t>SGP (15)</w:t>
+            </w:r>
+          </w:p>
+        </w:tc>
+        <w:tc>
+          <w:tcPr>
+            <w:tcW w:type="dxa" w:w="1072"/>
+            <w:shd w:val="clear" w:color="auto" w:fill="1F497D"/>
+          </w:tcPr>
+          <w:p>
+            <w:r>
+              <w:rPr>
+                <w:b/>
+                <w:color w:val="FFFFFF"/>
+                <w:sz w:val="16"/>
+              </w:rPr>
+              <w:t>BLR (16)</w:t>
             </w:r>
           </w:p>
         </w:tc>
@@ -5213,106 +5240,136 @@
       <w:tr>
         <w:tc>
           <w:tcPr>
-            <w:tcW w:w="1378" w:type="dxa"/>
-            <w:shd w:val="clear" w:color="auto" w:fill="EBF3FF"/>
-          </w:tcPr>
-          <w:p>
-            <w:r>
-              <w:rPr>
-                <w:rFonts w:ascii="Calibri" w:hAnsi="Calibri"/>
-                <w:sz w:val="18"/>
-              </w:rPr>
-              <w:t>SFO</w:t>
-            </w:r>
-          </w:p>
-        </w:tc>
-        <w:tc>
-          <w:tcPr>
-            <w:tcW w:w="1378" w:type="dxa"/>
-            <w:shd w:val="clear" w:color="auto" w:fill="EBF3FF"/>
-          </w:tcPr>
-          <w:p>
-            <w:r>
-              <w:rPr>
-                <w:rFonts w:ascii="Calibri" w:hAnsi="Calibri"/>
-                <w:sz w:val="18"/>
-              </w:rPr>
-              <w:t>10.11.0.0/16</w:t>
-            </w:r>
-          </w:p>
-        </w:tc>
-        <w:tc>
-          <w:tcPr>
-            <w:tcW w:w="1378" w:type="dxa"/>
-            <w:shd w:val="clear" w:color="auto" w:fill="EBF3FF"/>
-          </w:tcPr>
-          <w:p>
-            <w:r>
-              <w:rPr>
-                <w:rFonts w:ascii="Calibri" w:hAnsi="Calibri"/>
-                <w:sz w:val="18"/>
-              </w:rPr>
-              <w:t>VLAN10=Corp, VLAN20=Guest, VLAN30=Server, VLAN40=IoT</w:t>
-            </w:r>
-          </w:p>
-        </w:tc>
-        <w:tc>
-          <w:tcPr>
-            <w:tcW w:w="1378" w:type="dxa"/>
-            <w:shd w:val="clear" w:color="auto" w:fill="EBF3FF"/>
-          </w:tcPr>
-          <w:p>
-            <w:r>
-              <w:rPr>
-                <w:rFonts w:ascii="Calibri" w:hAnsi="Calibri"/>
-                <w:sz w:val="18"/>
-              </w:rPr>
-              <w:t>23</w:t>
-            </w:r>
-          </w:p>
-        </w:tc>
-        <w:tc>
-          <w:tcPr>
-            <w:tcW w:w="1378" w:type="dxa"/>
-            <w:shd w:val="clear" w:color="auto" w:fill="EBF3FF"/>
-          </w:tcPr>
-          <w:p>
-            <w:r>
-              <w:rPr>
-                <w:rFonts w:ascii="Calibri" w:hAnsi="Calibri"/>
-                <w:sz w:val="18"/>
-              </w:rPr>
-              <w:t>14</w:t>
-            </w:r>
-          </w:p>
-        </w:tc>
-        <w:tc>
-          <w:tcPr>
-            <w:tcW w:w="1378" w:type="dxa"/>
-            <w:shd w:val="clear" w:color="auto" w:fill="EBF3FF"/>
-          </w:tcPr>
-          <w:p>
-            <w:r>
-              <w:rPr>
-                <w:rFonts w:ascii="Calibri" w:hAnsi="Calibri"/>
-                <w:sz w:val="18"/>
-              </w:rPr>
-              <w:t>2</w:t>
-            </w:r>
-          </w:p>
-        </w:tc>
-        <w:tc>
-          <w:tcPr>
-            <w:tcW w:w="1378" w:type="dxa"/>
-            <w:shd w:val="clear" w:color="auto" w:fill="EBF3FF"/>
-          </w:tcPr>
-          <w:p>
-            <w:r>
-              <w:rPr>
-                <w:rFonts w:ascii="Calibri" w:hAnsi="Calibri"/>
-                <w:sz w:val="18"/>
-              </w:rPr>
-              <w:t>10.11.180.0/24</w:t>
+            <w:tcW w:type="dxa" w:w="1072"/>
+            <w:shd w:val="clear" w:color="auto" w:fill="DCE6F1"/>
+          </w:tcPr>
+          <w:p>
+            <w:r>
+              <w:rPr>
+                <w:b w:val="0"/>
+                <w:sz w:val="16"/>
+              </w:rPr>
+              <w:t>1</w:t>
+            </w:r>
+          </w:p>
+        </w:tc>
+        <w:tc>
+          <w:tcPr>
+            <w:tcW w:type="dxa" w:w="1072"/>
+            <w:shd w:val="clear" w:color="auto" w:fill="DCE6F1"/>
+          </w:tcPr>
+          <w:p>
+            <w:r>
+              <w:rPr>
+                <w:b w:val="0"/>
+                <w:sz w:val="16"/>
+              </w:rPr>
+              <w:t>Corporate</w:t>
+            </w:r>
+          </w:p>
+        </w:tc>
+        <w:tc>
+          <w:tcPr>
+            <w:tcW w:type="dxa" w:w="1072"/>
+            <w:shd w:val="clear" w:color="auto" w:fill="DCE6F1"/>
+          </w:tcPr>
+          <w:p>
+            <w:r>
+              <w:rPr>
+                <w:b w:val="0"/>
+                <w:sz w:val="16"/>
+              </w:rPr>
+              <w:t>Win/Mac Laptop, Linux WS</w:t>
+            </w:r>
+          </w:p>
+        </w:tc>
+        <w:tc>
+          <w:tcPr>
+            <w:tcW w:type="dxa" w:w="1072"/>
+            <w:shd w:val="clear" w:color="auto" w:fill="DCE6F1"/>
+          </w:tcPr>
+          <w:p>
+            <w:r>
+              <w:rPr>
+                <w:b w:val="0"/>
+                <w:sz w:val="16"/>
+              </w:rPr>
+              <w:t>10.11.1.0/24</w:t>
+            </w:r>
+          </w:p>
+        </w:tc>
+        <w:tc>
+          <w:tcPr>
+            <w:tcW w:type="dxa" w:w="1072"/>
+            <w:shd w:val="clear" w:color="auto" w:fill="DCE6F1"/>
+          </w:tcPr>
+          <w:p>
+            <w:r>
+              <w:rPr>
+                <w:b w:val="0"/>
+                <w:sz w:val="16"/>
+              </w:rPr>
+              <w:t>10.12.1.0/24</w:t>
+            </w:r>
+          </w:p>
+        </w:tc>
+        <w:tc>
+          <w:tcPr>
+            <w:tcW w:type="dxa" w:w="1072"/>
+            <w:shd w:val="clear" w:color="auto" w:fill="DCE6F1"/>
+          </w:tcPr>
+          <w:p>
+            <w:r>
+              <w:rPr>
+                <w:b w:val="0"/>
+                <w:sz w:val="16"/>
+              </w:rPr>
+              <w:t>10.13.1.0/24</w:t>
+            </w:r>
+          </w:p>
+        </w:tc>
+        <w:tc>
+          <w:tcPr>
+            <w:tcW w:type="dxa" w:w="1072"/>
+            <w:shd w:val="clear" w:color="auto" w:fill="DCE6F1"/>
+          </w:tcPr>
+          <w:p>
+            <w:r>
+              <w:rPr>
+                <w:b w:val="0"/>
+                <w:sz w:val="16"/>
+              </w:rPr>
+              <w:t>10.14.1.0/24</w:t>
+            </w:r>
+          </w:p>
+        </w:tc>
+        <w:tc>
+          <w:tcPr>
+            <w:tcW w:type="dxa" w:w="1072"/>
+            <w:shd w:val="clear" w:color="auto" w:fill="DCE6F1"/>
+          </w:tcPr>
+          <w:p>
+            <w:r>
+              <w:rPr>
+                <w:b w:val="0"/>
+                <w:sz w:val="16"/>
+              </w:rPr>
+              <w:t>10.15.1.0/24</w:t>
+            </w:r>
+          </w:p>
+        </w:tc>
+        <w:tc>
+          <w:tcPr>
+            <w:tcW w:type="dxa" w:w="1072"/>
+            <w:shd w:val="clear" w:color="auto" w:fill="DCE6F1"/>
+          </w:tcPr>
+          <w:p>
+            <w:r>
+              <w:rPr>
+                <w:b w:val="0"/>
+                <w:sz w:val="16"/>
+              </w:rPr>
+              <w:t>10.16.1.0/24</w:t>
             </w:r>
           </w:p>
         </w:tc>
@@ -5320,99 +5377,136 @@
       <w:tr>
         <w:tc>
           <w:tcPr>
-            <w:tcW w:w="1378" w:type="dxa"/>
-          </w:tcPr>
-          <w:p>
-            <w:r>
-              <w:rPr>
-                <w:rFonts w:ascii="Calibri" w:hAnsi="Calibri"/>
-                <w:sz w:val="18"/>
-              </w:rPr>
-              <w:t>NYC</w:t>
-            </w:r>
-          </w:p>
-        </w:tc>
-        <w:tc>
-          <w:tcPr>
-            <w:tcW w:w="1378" w:type="dxa"/>
-          </w:tcPr>
-          <w:p>
-            <w:r>
-              <w:rPr>
-                <w:rFonts w:ascii="Calibri" w:hAnsi="Calibri"/>
-                <w:sz w:val="18"/>
-              </w:rPr>
-              <w:t>10.12.0.0/16</w:t>
-            </w:r>
-          </w:p>
-        </w:tc>
-        <w:tc>
-          <w:tcPr>
-            <w:tcW w:w="1378" w:type="dxa"/>
-          </w:tcPr>
-          <w:p>
-            <w:r>
-              <w:rPr>
-                <w:rFonts w:ascii="Calibri" w:hAnsi="Calibri"/>
-                <w:sz w:val="18"/>
-              </w:rPr>
-              <w:t>VLAN10=Corp, VLAN20=Guest, VLAN30=Server, VLAN40=IoT</w:t>
-            </w:r>
-          </w:p>
-        </w:tc>
-        <w:tc>
-          <w:tcPr>
-            <w:tcW w:w="1378" w:type="dxa"/>
-          </w:tcPr>
-          <w:p>
-            <w:r>
-              <w:rPr>
-                <w:rFonts w:ascii="Calibri" w:hAnsi="Calibri"/>
-                <w:sz w:val="18"/>
-              </w:rPr>
-              <w:t>22</w:t>
-            </w:r>
-          </w:p>
-        </w:tc>
-        <w:tc>
-          <w:tcPr>
-            <w:tcW w:w="1378" w:type="dxa"/>
-          </w:tcPr>
-          <w:p>
-            <w:r>
-              <w:rPr>
-                <w:rFonts w:ascii="Calibri" w:hAnsi="Calibri"/>
-                <w:sz w:val="18"/>
-              </w:rPr>
-              <w:t>12</w:t>
-            </w:r>
-          </w:p>
-        </w:tc>
-        <w:tc>
-          <w:tcPr>
-            <w:tcW w:w="1378" w:type="dxa"/>
-          </w:tcPr>
-          <w:p>
-            <w:r>
-              <w:rPr>
-                <w:rFonts w:ascii="Calibri" w:hAnsi="Calibri"/>
-                <w:sz w:val="18"/>
-              </w:rPr>
-              <w:t>2</w:t>
-            </w:r>
-          </w:p>
-        </w:tc>
-        <w:tc>
-          <w:tcPr>
-            <w:tcW w:w="1378" w:type="dxa"/>
-          </w:tcPr>
-          <w:p>
-            <w:r>
-              <w:rPr>
-                <w:rFonts w:ascii="Calibri" w:hAnsi="Calibri"/>
-                <w:sz w:val="18"/>
-              </w:rPr>
-              <w:t>10.12.180.0/24</w:t>
+            <w:tcW w:type="dxa" w:w="1072"/>
+            <w:shd w:val="clear" w:color="auto" w:fill="FFFFFF"/>
+          </w:tcPr>
+          <w:p>
+            <w:r>
+              <w:rPr>
+                <w:b w:val="0"/>
+                <w:sz w:val="16"/>
+              </w:rPr>
+              <w:t>4</w:t>
+            </w:r>
+          </w:p>
+        </w:tc>
+        <w:tc>
+          <w:tcPr>
+            <w:tcW w:type="dxa" w:w="1072"/>
+            <w:shd w:val="clear" w:color="auto" w:fill="FFFFFF"/>
+          </w:tcPr>
+          <w:p>
+            <w:r>
+              <w:rPr>
+                <w:b w:val="0"/>
+                <w:sz w:val="16"/>
+              </w:rPr>
+              <w:t>Mobile</w:t>
+            </w:r>
+          </w:p>
+        </w:tc>
+        <w:tc>
+          <w:tcPr>
+            <w:tcW w:type="dxa" w:w="1072"/>
+            <w:shd w:val="clear" w:color="auto" w:fill="FFFFFF"/>
+          </w:tcPr>
+          <w:p>
+            <w:r>
+              <w:rPr>
+                <w:b w:val="0"/>
+                <w:sz w:val="16"/>
+              </w:rPr>
+              <w:t>iOS, Android</w:t>
+            </w:r>
+          </w:p>
+        </w:tc>
+        <w:tc>
+          <w:tcPr>
+            <w:tcW w:type="dxa" w:w="1072"/>
+            <w:shd w:val="clear" w:color="auto" w:fill="FFFFFF"/>
+          </w:tcPr>
+          <w:p>
+            <w:r>
+              <w:rPr>
+                <w:b w:val="0"/>
+                <w:sz w:val="16"/>
+              </w:rPr>
+              <w:t>10.11.4.0/24</w:t>
+            </w:r>
+          </w:p>
+        </w:tc>
+        <w:tc>
+          <w:tcPr>
+            <w:tcW w:type="dxa" w:w="1072"/>
+            <w:shd w:val="clear" w:color="auto" w:fill="FFFFFF"/>
+          </w:tcPr>
+          <w:p>
+            <w:r>
+              <w:rPr>
+                <w:b w:val="0"/>
+                <w:sz w:val="16"/>
+              </w:rPr>
+              <w:t>10.12.4.0/24</w:t>
+            </w:r>
+          </w:p>
+        </w:tc>
+        <w:tc>
+          <w:tcPr>
+            <w:tcW w:type="dxa" w:w="1072"/>
+            <w:shd w:val="clear" w:color="auto" w:fill="FFFFFF"/>
+          </w:tcPr>
+          <w:p>
+            <w:r>
+              <w:rPr>
+                <w:b w:val="0"/>
+                <w:sz w:val="16"/>
+              </w:rPr>
+              <w:t>10.13.4.0/24</w:t>
+            </w:r>
+          </w:p>
+        </w:tc>
+        <w:tc>
+          <w:tcPr>
+            <w:tcW w:type="dxa" w:w="1072"/>
+            <w:shd w:val="clear" w:color="auto" w:fill="FFFFFF"/>
+          </w:tcPr>
+          <w:p>
+            <w:r>
+              <w:rPr>
+                <w:b w:val="0"/>
+                <w:sz w:val="16"/>
+              </w:rPr>
+              <w:t>10.14.4.0/24</w:t>
+            </w:r>
+          </w:p>
+        </w:tc>
+        <w:tc>
+          <w:tcPr>
+            <w:tcW w:type="dxa" w:w="1072"/>
+            <w:shd w:val="clear" w:color="auto" w:fill="FFFFFF"/>
+          </w:tcPr>
+          <w:p>
+            <w:r>
+              <w:rPr>
+                <w:b w:val="0"/>
+                <w:sz w:val="16"/>
+              </w:rPr>
+              <w:t>10.15.4.0/24</w:t>
+            </w:r>
+          </w:p>
+        </w:tc>
+        <w:tc>
+          <w:tcPr>
+            <w:tcW w:type="dxa" w:w="1072"/>
+            <w:shd w:val="clear" w:color="auto" w:fill="FFFFFF"/>
+          </w:tcPr>
+          <w:p>
+            <w:r>
+              <w:rPr>
+                <w:b w:val="0"/>
+                <w:sz w:val="16"/>
+              </w:rPr>
+              <w:t>10.16.4.0/24</w:t>
             </w:r>
           </w:p>
         </w:tc>
@@ -5420,106 +5514,136 @@
       <w:tr>
         <w:tc>
           <w:tcPr>
-            <w:tcW w:w="1378" w:type="dxa"/>
-            <w:shd w:val="clear" w:color="auto" w:fill="EBF3FF"/>
-          </w:tcPr>
-          <w:p>
-            <w:r>
-              <w:rPr>
-                <w:rFonts w:ascii="Calibri" w:hAnsi="Calibri"/>
-                <w:sz w:val="18"/>
-              </w:rPr>
-              <w:t>LON</w:t>
-            </w:r>
-          </w:p>
-        </w:tc>
-        <w:tc>
-          <w:tcPr>
-            <w:tcW w:w="1378" w:type="dxa"/>
-            <w:shd w:val="clear" w:color="auto" w:fill="EBF3FF"/>
-          </w:tcPr>
-          <w:p>
-            <w:r>
-              <w:rPr>
-                <w:rFonts w:ascii="Calibri" w:hAnsi="Calibri"/>
-                <w:sz w:val="18"/>
-              </w:rPr>
-              <w:t>10.13.0.0/16</w:t>
-            </w:r>
-          </w:p>
-        </w:tc>
-        <w:tc>
-          <w:tcPr>
-            <w:tcW w:w="1378" w:type="dxa"/>
-            <w:shd w:val="clear" w:color="auto" w:fill="EBF3FF"/>
-          </w:tcPr>
-          <w:p>
-            <w:r>
-              <w:rPr>
-                <w:rFonts w:ascii="Calibri" w:hAnsi="Calibri"/>
-                <w:sz w:val="18"/>
-              </w:rPr>
-              <w:t>VLAN10=Corp, VLAN20=Guest, VLAN30=Server, VLAN40=IoT</w:t>
-            </w:r>
-          </w:p>
-        </w:tc>
-        <w:tc>
-          <w:tcPr>
-            <w:tcW w:w="1378" w:type="dxa"/>
-            <w:shd w:val="clear" w:color="auto" w:fill="EBF3FF"/>
-          </w:tcPr>
-          <w:p>
-            <w:r>
-              <w:rPr>
-                <w:rFonts w:ascii="Calibri" w:hAnsi="Calibri"/>
-                <w:sz w:val="18"/>
-              </w:rPr>
-              <w:t>22</w:t>
-            </w:r>
-          </w:p>
-        </w:tc>
-        <w:tc>
-          <w:tcPr>
-            <w:tcW w:w="1378" w:type="dxa"/>
-            <w:shd w:val="clear" w:color="auto" w:fill="EBF3FF"/>
-          </w:tcPr>
-          <w:p>
-            <w:r>
-              <w:rPr>
-                <w:rFonts w:ascii="Calibri" w:hAnsi="Calibri"/>
-                <w:sz w:val="18"/>
-              </w:rPr>
-              <w:t>11</w:t>
-            </w:r>
-          </w:p>
-        </w:tc>
-        <w:tc>
-          <w:tcPr>
-            <w:tcW w:w="1378" w:type="dxa"/>
-            <w:shd w:val="clear" w:color="auto" w:fill="EBF3FF"/>
-          </w:tcPr>
-          <w:p>
-            <w:r>
-              <w:rPr>
-                <w:rFonts w:ascii="Calibri" w:hAnsi="Calibri"/>
-                <w:sz w:val="18"/>
-              </w:rPr>
-              <w:t>2</w:t>
-            </w:r>
-          </w:p>
-        </w:tc>
-        <w:tc>
-          <w:tcPr>
-            <w:tcW w:w="1378" w:type="dxa"/>
-            <w:shd w:val="clear" w:color="auto" w:fill="EBF3FF"/>
-          </w:tcPr>
-          <w:p>
-            <w:r>
-              <w:rPr>
-                <w:rFonts w:ascii="Calibri" w:hAnsi="Calibri"/>
-                <w:sz w:val="18"/>
-              </w:rPr>
-              <w:t>10.13.180.0/24</w:t>
+            <w:tcW w:type="dxa" w:w="1072"/>
+            <w:shd w:val="clear" w:color="auto" w:fill="DCE6F1"/>
+          </w:tcPr>
+          <w:p>
+            <w:r>
+              <w:rPr>
+                <w:b w:val="0"/>
+                <w:sz w:val="16"/>
+              </w:rPr>
+              <w:t>5</w:t>
+            </w:r>
+          </w:p>
+        </w:tc>
+        <w:tc>
+          <w:tcPr>
+            <w:tcW w:type="dxa" w:w="1072"/>
+            <w:shd w:val="clear" w:color="auto" w:fill="DCE6F1"/>
+          </w:tcPr>
+          <w:p>
+            <w:r>
+              <w:rPr>
+                <w:b w:val="0"/>
+                <w:sz w:val="16"/>
+              </w:rPr>
+              <w:t>Printers</w:t>
+            </w:r>
+          </w:p>
+        </w:tc>
+        <w:tc>
+          <w:tcPr>
+            <w:tcW w:type="dxa" w:w="1072"/>
+            <w:shd w:val="clear" w:color="auto" w:fill="DCE6F1"/>
+          </w:tcPr>
+          <w:p>
+            <w:r>
+              <w:rPr>
+                <w:b w:val="0"/>
+                <w:sz w:val="16"/>
+              </w:rPr>
+              <w:t>Network Printers</w:t>
+            </w:r>
+          </w:p>
+        </w:tc>
+        <w:tc>
+          <w:tcPr>
+            <w:tcW w:type="dxa" w:w="1072"/>
+            <w:shd w:val="clear" w:color="auto" w:fill="DCE6F1"/>
+          </w:tcPr>
+          <w:p>
+            <w:r>
+              <w:rPr>
+                <w:b w:val="0"/>
+                <w:sz w:val="16"/>
+              </w:rPr>
+              <w:t>10.11.5.0/24</w:t>
+            </w:r>
+          </w:p>
+        </w:tc>
+        <w:tc>
+          <w:tcPr>
+            <w:tcW w:type="dxa" w:w="1072"/>
+            <w:shd w:val="clear" w:color="auto" w:fill="DCE6F1"/>
+          </w:tcPr>
+          <w:p>
+            <w:r>
+              <w:rPr>
+                <w:b w:val="0"/>
+                <w:sz w:val="16"/>
+              </w:rPr>
+              <w:t>10.12.5.0/24</w:t>
+            </w:r>
+          </w:p>
+        </w:tc>
+        <w:tc>
+          <w:tcPr>
+            <w:tcW w:type="dxa" w:w="1072"/>
+            <w:shd w:val="clear" w:color="auto" w:fill="DCE6F1"/>
+          </w:tcPr>
+          <w:p>
+            <w:r>
+              <w:rPr>
+                <w:b w:val="0"/>
+                <w:sz w:val="16"/>
+              </w:rPr>
+              <w:t>10.13.5.0/24</w:t>
+            </w:r>
+          </w:p>
+        </w:tc>
+        <w:tc>
+          <w:tcPr>
+            <w:tcW w:type="dxa" w:w="1072"/>
+            <w:shd w:val="clear" w:color="auto" w:fill="DCE6F1"/>
+          </w:tcPr>
+          <w:p>
+            <w:r>
+              <w:rPr>
+                <w:b w:val="0"/>
+                <w:sz w:val="16"/>
+              </w:rPr>
+              <w:t>10.14.5.0/24</w:t>
+            </w:r>
+          </w:p>
+        </w:tc>
+        <w:tc>
+          <w:tcPr>
+            <w:tcW w:type="dxa" w:w="1072"/>
+            <w:shd w:val="clear" w:color="auto" w:fill="DCE6F1"/>
+          </w:tcPr>
+          <w:p>
+            <w:r>
+              <w:rPr>
+                <w:b w:val="0"/>
+                <w:sz w:val="16"/>
+              </w:rPr>
+              <w:t>10.15.5.0/24</w:t>
+            </w:r>
+          </w:p>
+        </w:tc>
+        <w:tc>
+          <w:tcPr>
+            <w:tcW w:type="dxa" w:w="1072"/>
+            <w:shd w:val="clear" w:color="auto" w:fill="DCE6F1"/>
+          </w:tcPr>
+          <w:p>
+            <w:r>
+              <w:rPr>
+                <w:b w:val="0"/>
+                <w:sz w:val="16"/>
+              </w:rPr>
+              <w:t>10.16.5.0/24</w:t>
             </w:r>
           </w:p>
         </w:tc>
@@ -5527,99 +5651,136 @@
       <w:tr>
         <w:tc>
           <w:tcPr>
-            <w:tcW w:w="1378" w:type="dxa"/>
-          </w:tcPr>
-          <w:p>
-            <w:r>
-              <w:rPr>
-                <w:rFonts w:ascii="Calibri" w:hAnsi="Calibri"/>
-                <w:sz w:val="18"/>
-              </w:rPr>
-              <w:t>AMS</w:t>
-            </w:r>
-          </w:p>
-        </w:tc>
-        <w:tc>
-          <w:tcPr>
-            <w:tcW w:w="1378" w:type="dxa"/>
-          </w:tcPr>
-          <w:p>
-            <w:r>
-              <w:rPr>
-                <w:rFonts w:ascii="Calibri" w:hAnsi="Calibri"/>
-                <w:sz w:val="18"/>
-              </w:rPr>
-              <w:t>10.14.0.0/16</w:t>
-            </w:r>
-          </w:p>
-        </w:tc>
-        <w:tc>
-          <w:tcPr>
-            <w:tcW w:w="1378" w:type="dxa"/>
-          </w:tcPr>
-          <w:p>
-            <w:r>
-              <w:rPr>
-                <w:rFonts w:ascii="Calibri" w:hAnsi="Calibri"/>
-                <w:sz w:val="18"/>
-              </w:rPr>
-              <w:t>VLAN10=Corp, VLAN20=Guest, VLAN30=Server, VLAN40=IoT</w:t>
-            </w:r>
-          </w:p>
-        </w:tc>
-        <w:tc>
-          <w:tcPr>
-            <w:tcW w:w="1378" w:type="dxa"/>
-          </w:tcPr>
-          <w:p>
-            <w:r>
-              <w:rPr>
-                <w:rFonts w:ascii="Calibri" w:hAnsi="Calibri"/>
-                <w:sz w:val="18"/>
-              </w:rPr>
-              <w:t>23</w:t>
-            </w:r>
-          </w:p>
-        </w:tc>
-        <w:tc>
-          <w:tcPr>
-            <w:tcW w:w="1378" w:type="dxa"/>
-          </w:tcPr>
-          <w:p>
-            <w:r>
-              <w:rPr>
-                <w:rFonts w:ascii="Calibri" w:hAnsi="Calibri"/>
-                <w:sz w:val="18"/>
-              </w:rPr>
-              <w:t>12</w:t>
-            </w:r>
-          </w:p>
-        </w:tc>
-        <w:tc>
-          <w:tcPr>
-            <w:tcW w:w="1378" w:type="dxa"/>
-          </w:tcPr>
-          <w:p>
-            <w:r>
-              <w:rPr>
-                <w:rFonts w:ascii="Calibri" w:hAnsi="Calibri"/>
-                <w:sz w:val="18"/>
-              </w:rPr>
-              <w:t>3</w:t>
-            </w:r>
-          </w:p>
-        </w:tc>
-        <w:tc>
-          <w:tcPr>
-            <w:tcW w:w="1378" w:type="dxa"/>
-          </w:tcPr>
-          <w:p>
-            <w:r>
-              <w:rPr>
-                <w:rFonts w:ascii="Calibri" w:hAnsi="Calibri"/>
-                <w:sz w:val="18"/>
-              </w:rPr>
-              <w:t>10.14.180.0/24</w:t>
+            <w:tcW w:type="dxa" w:w="1072"/>
+            <w:shd w:val="clear" w:color="auto" w:fill="FFFFFF"/>
+          </w:tcPr>
+          <w:p>
+            <w:r>
+              <w:rPr>
+                <w:b w:val="0"/>
+                <w:sz w:val="16"/>
+              </w:rPr>
+              <w:t>6</w:t>
+            </w:r>
+          </w:p>
+        </w:tc>
+        <w:tc>
+          <w:tcPr>
+            <w:tcW w:type="dxa" w:w="1072"/>
+            <w:shd w:val="clear" w:color="auto" w:fill="FFFFFF"/>
+          </w:tcPr>
+          <w:p>
+            <w:r>
+              <w:rPr>
+                <w:b w:val="0"/>
+                <w:sz w:val="16"/>
+              </w:rPr>
+              <w:t>Access Points</w:t>
+            </w:r>
+          </w:p>
+        </w:tc>
+        <w:tc>
+          <w:tcPr>
+            <w:tcW w:type="dxa" w:w="1072"/>
+            <w:shd w:val="clear" w:color="auto" w:fill="FFFFFF"/>
+          </w:tcPr>
+          <w:p>
+            <w:r>
+              <w:rPr>
+                <w:b w:val="0"/>
+                <w:sz w:val="16"/>
+              </w:rPr>
+              <w:t>WAPs (management)</w:t>
+            </w:r>
+          </w:p>
+        </w:tc>
+        <w:tc>
+          <w:tcPr>
+            <w:tcW w:type="dxa" w:w="1072"/>
+            <w:shd w:val="clear" w:color="auto" w:fill="FFFFFF"/>
+          </w:tcPr>
+          <w:p>
+            <w:r>
+              <w:rPr>
+                <w:b w:val="0"/>
+                <w:sz w:val="16"/>
+              </w:rPr>
+              <w:t>10.11.6.0/24</w:t>
+            </w:r>
+          </w:p>
+        </w:tc>
+        <w:tc>
+          <w:tcPr>
+            <w:tcW w:type="dxa" w:w="1072"/>
+            <w:shd w:val="clear" w:color="auto" w:fill="FFFFFF"/>
+          </w:tcPr>
+          <w:p>
+            <w:r>
+              <w:rPr>
+                <w:b w:val="0"/>
+                <w:sz w:val="16"/>
+              </w:rPr>
+              <w:t>10.12.6.0/24</w:t>
+            </w:r>
+          </w:p>
+        </w:tc>
+        <w:tc>
+          <w:tcPr>
+            <w:tcW w:type="dxa" w:w="1072"/>
+            <w:shd w:val="clear" w:color="auto" w:fill="FFFFFF"/>
+          </w:tcPr>
+          <w:p>
+            <w:r>
+              <w:rPr>
+                <w:b w:val="0"/>
+                <w:sz w:val="16"/>
+              </w:rPr>
+              <w:t>10.13.6.0/24</w:t>
+            </w:r>
+          </w:p>
+        </w:tc>
+        <w:tc>
+          <w:tcPr>
+            <w:tcW w:type="dxa" w:w="1072"/>
+            <w:shd w:val="clear" w:color="auto" w:fill="FFFFFF"/>
+          </w:tcPr>
+          <w:p>
+            <w:r>
+              <w:rPr>
+                <w:b w:val="0"/>
+                <w:sz w:val="16"/>
+              </w:rPr>
+              <w:t>10.14.6.0/24</w:t>
+            </w:r>
+          </w:p>
+        </w:tc>
+        <w:tc>
+          <w:tcPr>
+            <w:tcW w:type="dxa" w:w="1072"/>
+            <w:shd w:val="clear" w:color="auto" w:fill="FFFFFF"/>
+          </w:tcPr>
+          <w:p>
+            <w:r>
+              <w:rPr>
+                <w:b w:val="0"/>
+                <w:sz w:val="16"/>
+              </w:rPr>
+              <w:t>10.15.6.0/24</w:t>
+            </w:r>
+          </w:p>
+        </w:tc>
+        <w:tc>
+          <w:tcPr>
+            <w:tcW w:type="dxa" w:w="1072"/>
+            <w:shd w:val="clear" w:color="auto" w:fill="FFFFFF"/>
+          </w:tcPr>
+          <w:p>
+            <w:r>
+              <w:rPr>
+                <w:b w:val="0"/>
+                <w:sz w:val="16"/>
+              </w:rPr>
+              <w:t>10.16.6.0/24</w:t>
             </w:r>
           </w:p>
         </w:tc>
@@ -5627,106 +5788,135 @@
       <w:tr>
         <w:tc>
           <w:tcPr>
-            <w:tcW w:w="1378" w:type="dxa"/>
-            <w:shd w:val="clear" w:color="auto" w:fill="EBF3FF"/>
-          </w:tcPr>
-          <w:p>
-            <w:r>
-              <w:rPr>
-                <w:rFonts w:ascii="Calibri" w:hAnsi="Calibri"/>
-                <w:sz w:val="18"/>
-              </w:rPr>
-              <w:t>SGP</w:t>
-            </w:r>
-          </w:p>
-        </w:tc>
-        <w:tc>
-          <w:tcPr>
-            <w:tcW w:w="1378" w:type="dxa"/>
-            <w:shd w:val="clear" w:color="auto" w:fill="EBF3FF"/>
-          </w:tcPr>
-          <w:p>
-            <w:r>
-              <w:rPr>
-                <w:rFonts w:ascii="Calibri" w:hAnsi="Calibri"/>
-                <w:sz w:val="18"/>
-              </w:rPr>
-              <w:t>10.15.0.0/16</w:t>
-            </w:r>
-          </w:p>
-        </w:tc>
-        <w:tc>
-          <w:tcPr>
-            <w:tcW w:w="1378" w:type="dxa"/>
-            <w:shd w:val="clear" w:color="auto" w:fill="EBF3FF"/>
-          </w:tcPr>
-          <w:p>
-            <w:r>
-              <w:rPr>
-                <w:rFonts w:ascii="Calibri" w:hAnsi="Calibri"/>
-                <w:sz w:val="18"/>
-              </w:rPr>
-              <w:t>VLAN10=Corp, VLAN20=Guest, VLAN30=Server, VLAN40=IoT</w:t>
-            </w:r>
-          </w:p>
-        </w:tc>
-        <w:tc>
-          <w:tcPr>
-            <w:tcW w:w="1378" w:type="dxa"/>
-            <w:shd w:val="clear" w:color="auto" w:fill="EBF3FF"/>
-          </w:tcPr>
-          <w:p>
-            <w:r>
-              <w:rPr>
-                <w:rFonts w:ascii="Calibri" w:hAnsi="Calibri"/>
-                <w:sz w:val="18"/>
-              </w:rPr>
-              <w:t>22</w:t>
-            </w:r>
-          </w:p>
-        </w:tc>
-        <w:tc>
-          <w:tcPr>
-            <w:tcW w:w="1378" w:type="dxa"/>
-            <w:shd w:val="clear" w:color="auto" w:fill="EBF3FF"/>
-          </w:tcPr>
-          <w:p>
-            <w:r>
-              <w:rPr>
-                <w:rFonts w:ascii="Calibri" w:hAnsi="Calibri"/>
-                <w:sz w:val="18"/>
-              </w:rPr>
-              <w:t>11</w:t>
-            </w:r>
-          </w:p>
-        </w:tc>
-        <w:tc>
-          <w:tcPr>
-            <w:tcW w:w="1378" w:type="dxa"/>
-            <w:shd w:val="clear" w:color="auto" w:fill="EBF3FF"/>
-          </w:tcPr>
-          <w:p>
-            <w:r>
-              <w:rPr>
-                <w:rFonts w:ascii="Calibri" w:hAnsi="Calibri"/>
-                <w:sz w:val="18"/>
-              </w:rPr>
-              <w:t>2</w:t>
-            </w:r>
-          </w:p>
-        </w:tc>
-        <w:tc>
-          <w:tcPr>
-            <w:tcW w:w="1378" w:type="dxa"/>
-            <w:shd w:val="clear" w:color="auto" w:fill="EBF3FF"/>
-          </w:tcPr>
-          <w:p>
-            <w:r>
-              <w:rPr>
-                <w:rFonts w:ascii="Calibri" w:hAnsi="Calibri"/>
-                <w:sz w:val="18"/>
-              </w:rPr>
-              <w:t>10.15.180.0/24</w:t>
+            <w:tcW w:type="dxa" w:w="1072"/>
+            <w:shd w:val="clear" w:color="auto" w:fill="F2F2F2"/>
+          </w:tcPr>
+          <w:p>
+            <w:r>
+              <w:rPr>
+                <w:b w:val="0"/>
+                <w:sz w:val="16"/>
+              </w:rPr>
+              <w:t>8</w:t>
+            </w:r>
+          </w:p>
+        </w:tc>
+        <w:tc>
+          <w:tcPr>
+            <w:tcW w:type="dxa" w:w="1072"/>
+            <w:shd w:val="clear" w:color="auto" w:fill="F2F2F2"/>
+          </w:tcPr>
+          <w:p>
+            <w:r>
+              <w:rPr>
+                <w:b w:val="0"/>
+                <w:sz w:val="16"/>
+              </w:rPr>
+              <w:t>IoT</w:t>
+            </w:r>
+          </w:p>
+        </w:tc>
+        <w:tc>
+          <w:tcPr>
+            <w:tcW w:type="dxa" w:w="1072"/>
+            <w:shd w:val="clear" w:color="auto" w:fill="F2F2F2"/>
+          </w:tcPr>
+          <w:p>
+            <w:r>
+              <w:rPr>
+                <w:b w:val="0"/>
+                <w:sz w:val="16"/>
+              </w:rPr>
+            </w:r>
+          </w:p>
+        </w:tc>
+        <w:tc>
+          <w:tcPr>
+            <w:tcW w:type="dxa" w:w="1072"/>
+            <w:shd w:val="clear" w:color="auto" w:fill="F2F2F2"/>
+          </w:tcPr>
+          <w:p>
+            <w:r>
+              <w:rPr>
+                <w:b w:val="0"/>
+                <w:sz w:val="16"/>
+              </w:rPr>
+              <w:t>10.11.8.0/24</w:t>
+            </w:r>
+          </w:p>
+        </w:tc>
+        <w:tc>
+          <w:tcPr>
+            <w:tcW w:type="dxa" w:w="1072"/>
+            <w:shd w:val="clear" w:color="auto" w:fill="F2F2F2"/>
+          </w:tcPr>
+          <w:p>
+            <w:r>
+              <w:rPr>
+                <w:b w:val="0"/>
+                <w:sz w:val="16"/>
+              </w:rPr>
+              <w:t>10.12.8.0/24</w:t>
+            </w:r>
+          </w:p>
+        </w:tc>
+        <w:tc>
+          <w:tcPr>
+            <w:tcW w:type="dxa" w:w="1072"/>
+            <w:shd w:val="clear" w:color="auto" w:fill="F2F2F2"/>
+          </w:tcPr>
+          <w:p>
+            <w:r>
+              <w:rPr>
+                <w:b w:val="0"/>
+                <w:sz w:val="16"/>
+              </w:rPr>
+              <w:t>10.13.8.0/24</w:t>
+            </w:r>
+          </w:p>
+        </w:tc>
+        <w:tc>
+          <w:tcPr>
+            <w:tcW w:type="dxa" w:w="1072"/>
+            <w:shd w:val="clear" w:color="auto" w:fill="F2F2F2"/>
+          </w:tcPr>
+          <w:p>
+            <w:r>
+              <w:rPr>
+                <w:b w:val="0"/>
+                <w:sz w:val="16"/>
+              </w:rPr>
+              <w:t>10.14.8.0/24</w:t>
+            </w:r>
+          </w:p>
+        </w:tc>
+        <w:tc>
+          <w:tcPr>
+            <w:tcW w:type="dxa" w:w="1072"/>
+            <w:shd w:val="clear" w:color="auto" w:fill="F2F2F2"/>
+          </w:tcPr>
+          <w:p>
+            <w:r>
+              <w:rPr>
+                <w:b w:val="0"/>
+                <w:sz w:val="16"/>
+              </w:rPr>
+              <w:t>10.15.8.0/24</w:t>
+            </w:r>
+          </w:p>
+        </w:tc>
+        <w:tc>
+          <w:tcPr>
+            <w:tcW w:type="dxa" w:w="1072"/>
+            <w:shd w:val="clear" w:color="auto" w:fill="F2F2F2"/>
+          </w:tcPr>
+          <w:p>
+            <w:r>
+              <w:rPr>
+                <w:b w:val="0"/>
+                <w:sz w:val="16"/>
+              </w:rPr>
+              <w:t>10.16.8.0/24</w:t>
             </w:r>
           </w:p>
         </w:tc>
@@ -5734,97 +5924,408 @@
       <w:tr>
         <w:tc>
           <w:tcPr>
-            <w:tcW w:w="1378" w:type="dxa"/>
-          </w:tcPr>
-          <w:p>
-            <w:r>
-              <w:rPr>
-                <w:rFonts w:ascii="Calibri" w:hAnsi="Calibri"/>
-                <w:sz w:val="18"/>
-              </w:rPr>
-              <w:t>BLR</w:t>
-            </w:r>
-          </w:p>
-        </w:tc>
-        <w:tc>
-          <w:tcPr>
-            <w:tcW w:w="1378" w:type="dxa"/>
-          </w:tcPr>
-          <w:p>
-            <w:r>
-              <w:rPr>
-                <w:rFonts w:ascii="Calibri" w:hAnsi="Calibri"/>
-                <w:sz w:val="18"/>
-              </w:rPr>
-              <w:t>10.16.0.0/16</w:t>
-            </w:r>
-          </w:p>
-        </w:tc>
-        <w:tc>
-          <w:tcPr>
-            <w:tcW w:w="1378" w:type="dxa"/>
-          </w:tcPr>
-          <w:p>
-            <w:r>
-              <w:rPr>
-                <w:rFonts w:ascii="Calibri" w:hAnsi="Calibri"/>
-                <w:sz w:val="18"/>
-              </w:rPr>
-              <w:t>VLAN10=Corp, VLAN20=Guest, VLAN30=Server, VLAN40=IoT</w:t>
-            </w:r>
-          </w:p>
-        </w:tc>
-        <w:tc>
-          <w:tcPr>
-            <w:tcW w:w="1378" w:type="dxa"/>
-          </w:tcPr>
-          <w:p>
-            <w:r>
-              <w:rPr>
-                <w:rFonts w:ascii="Calibri" w:hAnsi="Calibri"/>
-                <w:sz w:val="18"/>
-              </w:rPr>
-              <w:t>23</w:t>
-            </w:r>
-          </w:p>
-        </w:tc>
-        <w:tc>
-          <w:tcPr>
-            <w:tcW w:w="1378" w:type="dxa"/>
-          </w:tcPr>
-          <w:p>
-            <w:r>
-              <w:rPr>
-                <w:rFonts w:ascii="Calibri" w:hAnsi="Calibri"/>
-                <w:sz w:val="18"/>
-              </w:rPr>
-              <w:t>10</w:t>
-            </w:r>
-          </w:p>
-        </w:tc>
-        <w:tc>
-          <w:tcPr>
-            <w:tcW w:w="1378" w:type="dxa"/>
-          </w:tcPr>
-          <w:p>
-            <w:r>
-              <w:rPr>
-                <w:rFonts w:ascii="Calibri" w:hAnsi="Calibri"/>
-                <w:sz w:val="18"/>
-              </w:rPr>
-              <w:t>3</w:t>
-            </w:r>
-          </w:p>
-        </w:tc>
-        <w:tc>
-          <w:tcPr>
-            <w:tcW w:w="1378" w:type="dxa"/>
-          </w:tcPr>
-          <w:p>
-            <w:r>
-              <w:rPr>
-                <w:rFonts w:ascii="Calibri" w:hAnsi="Calibri"/>
-                <w:sz w:val="18"/>
+            <w:tcW w:type="dxa" w:w="1072"/>
+            <w:shd w:val="clear" w:color="auto" w:fill="FFFFFF"/>
+          </w:tcPr>
+          <w:p>
+            <w:r>
+              <w:rPr>
+                <w:b w:val="0"/>
+                <w:sz w:val="16"/>
+              </w:rPr>
+              <w:t>9</w:t>
+            </w:r>
+          </w:p>
+        </w:tc>
+        <w:tc>
+          <w:tcPr>
+            <w:tcW w:type="dxa" w:w="1072"/>
+            <w:shd w:val="clear" w:color="auto" w:fill="FFFFFF"/>
+          </w:tcPr>
+          <w:p>
+            <w:r>
+              <w:rPr>
+                <w:b w:val="0"/>
+                <w:sz w:val="16"/>
+              </w:rPr>
+              <w:t>Clinical</w:t>
+            </w:r>
+          </w:p>
+        </w:tc>
+        <w:tc>
+          <w:tcPr>
+            <w:tcW w:type="dxa" w:w="1072"/>
+            <w:shd w:val="clear" w:color="auto" w:fill="FFFFFF"/>
+          </w:tcPr>
+          <w:p>
+            <w:r>
+              <w:rPr>
+                <w:b w:val="0"/>
+                <w:sz w:val="16"/>
+              </w:rPr>
+              <w:t>Medical Devices</w:t>
+            </w:r>
+          </w:p>
+        </w:tc>
+        <w:tc>
+          <w:tcPr>
+            <w:tcW w:type="dxa" w:w="1072"/>
+            <w:shd w:val="clear" w:color="auto" w:fill="FFFFFF"/>
+          </w:tcPr>
+          <w:p>
+            <w:r>
+              <w:rPr>
+                <w:b w:val="0"/>
+                <w:sz w:val="16"/>
+              </w:rPr>
+              <w:t>10.11.9.0/24</w:t>
+            </w:r>
+          </w:p>
+        </w:tc>
+        <w:tc>
+          <w:tcPr>
+            <w:tcW w:type="dxa" w:w="1072"/>
+            <w:shd w:val="clear" w:color="auto" w:fill="FFFFFF"/>
+          </w:tcPr>
+          <w:p>
+            <w:r>
+              <w:rPr>
+                <w:b w:val="0"/>
+                <w:sz w:val="16"/>
+              </w:rPr>
+              <w:t>10.12.9.0/24</w:t>
+            </w:r>
+          </w:p>
+        </w:tc>
+        <w:tc>
+          <w:tcPr>
+            <w:tcW w:type="dxa" w:w="1072"/>
+            <w:shd w:val="clear" w:color="auto" w:fill="FFFFFF"/>
+          </w:tcPr>
+          <w:p>
+            <w:r>
+              <w:rPr>
+                <w:b w:val="0"/>
+                <w:sz w:val="16"/>
+              </w:rPr>
+              <w:t>10.13.9.0/24</w:t>
+            </w:r>
+          </w:p>
+        </w:tc>
+        <w:tc>
+          <w:tcPr>
+            <w:tcW w:type="dxa" w:w="1072"/>
+            <w:shd w:val="clear" w:color="auto" w:fill="FFFFFF"/>
+          </w:tcPr>
+          <w:p>
+            <w:r>
+              <w:rPr>
+                <w:b w:val="0"/>
+                <w:sz w:val="16"/>
+              </w:rPr>
+              <w:t>10.14.9.0/24</w:t>
+            </w:r>
+          </w:p>
+        </w:tc>
+        <w:tc>
+          <w:tcPr>
+            <w:tcW w:type="dxa" w:w="1072"/>
+            <w:shd w:val="clear" w:color="auto" w:fill="FFFFFF"/>
+          </w:tcPr>
+          <w:p>
+            <w:r>
+              <w:rPr>
+                <w:b w:val="0"/>
+                <w:sz w:val="16"/>
+              </w:rPr>
+              <w:t>10.15.9.0/24</w:t>
+            </w:r>
+          </w:p>
+        </w:tc>
+        <w:tc>
+          <w:tcPr>
+            <w:tcW w:type="dxa" w:w="1072"/>
+            <w:shd w:val="clear" w:color="auto" w:fill="FFFFFF"/>
+          </w:tcPr>
+          <w:p>
+            <w:r>
+              <w:rPr>
+                <w:b w:val="0"/>
+                <w:sz w:val="16"/>
+              </w:rPr>
+              <w:t>10.16.9.0/24</w:t>
+            </w:r>
+          </w:p>
+        </w:tc>
+      </w:tr>
+      <w:tr>
+        <w:tc>
+          <w:tcPr>
+            <w:tcW w:type="dxa" w:w="1072"/>
+            <w:shd w:val="clear" w:color="auto" w:fill="DCE6F1"/>
+          </w:tcPr>
+          <w:p>
+            <w:r>
+              <w:rPr>
+                <w:b w:val="0"/>
+                <w:sz w:val="16"/>
+              </w:rPr>
+              <w:t>0</w:t>
+            </w:r>
+          </w:p>
+        </w:tc>
+        <w:tc>
+          <w:tcPr>
+            <w:tcW w:type="dxa" w:w="1072"/>
+            <w:shd w:val="clear" w:color="auto" w:fill="DCE6F1"/>
+          </w:tcPr>
+          <w:p>
+            <w:r>
+              <w:rPr>
+                <w:b w:val="0"/>
+                <w:sz w:val="16"/>
+              </w:rPr>
+              <w:t>Management</w:t>
+            </w:r>
+          </w:p>
+        </w:tc>
+        <w:tc>
+          <w:tcPr>
+            <w:tcW w:type="dxa" w:w="1072"/>
+            <w:shd w:val="clear" w:color="auto" w:fill="DCE6F1"/>
+          </w:tcPr>
+          <w:p>
+            <w:r>
+              <w:rPr>
+                <w:b w:val="0"/>
+                <w:sz w:val="16"/>
+              </w:rPr>
+              <w:t>Switches, Routers, Appliances</w:t>
+            </w:r>
+          </w:p>
+        </w:tc>
+        <w:tc>
+          <w:tcPr>
+            <w:tcW w:type="dxa" w:w="1072"/>
+            <w:shd w:val="clear" w:color="auto" w:fill="DCE6F1"/>
+          </w:tcPr>
+          <w:p>
+            <w:r>
+              <w:rPr>
+                <w:b w:val="0"/>
+                <w:sz w:val="16"/>
+              </w:rPr>
+              <w:t>10.11.0.0/24</w:t>
+            </w:r>
+          </w:p>
+        </w:tc>
+        <w:tc>
+          <w:tcPr>
+            <w:tcW w:type="dxa" w:w="1072"/>
+            <w:shd w:val="clear" w:color="auto" w:fill="DCE6F1"/>
+          </w:tcPr>
+          <w:p>
+            <w:r>
+              <w:rPr>
+                <w:b w:val="0"/>
+                <w:sz w:val="16"/>
+              </w:rPr>
+              <w:t>10.12.0.0/24</w:t>
+            </w:r>
+          </w:p>
+        </w:tc>
+        <w:tc>
+          <w:tcPr>
+            <w:tcW w:type="dxa" w:w="1072"/>
+            <w:shd w:val="clear" w:color="auto" w:fill="DCE6F1"/>
+          </w:tcPr>
+          <w:p>
+            <w:r>
+              <w:rPr>
+                <w:b w:val="0"/>
+                <w:sz w:val="16"/>
+              </w:rPr>
+              <w:t>10.13.0.0/24</w:t>
+            </w:r>
+          </w:p>
+        </w:tc>
+        <w:tc>
+          <w:tcPr>
+            <w:tcW w:type="dxa" w:w="1072"/>
+            <w:shd w:val="clear" w:color="auto" w:fill="DCE6F1"/>
+          </w:tcPr>
+          <w:p>
+            <w:r>
+              <w:rPr>
+                <w:b w:val="0"/>
+                <w:sz w:val="16"/>
+              </w:rPr>
+              <w:t>10.14.0.0/24</w:t>
+            </w:r>
+          </w:p>
+        </w:tc>
+        <w:tc>
+          <w:tcPr>
+            <w:tcW w:type="dxa" w:w="1072"/>
+            <w:shd w:val="clear" w:color="auto" w:fill="DCE6F1"/>
+          </w:tcPr>
+          <w:p>
+            <w:r>
+              <w:rPr>
+                <w:b w:val="0"/>
+                <w:sz w:val="16"/>
+              </w:rPr>
+              <w:t>10.15.0.0/24</w:t>
+            </w:r>
+          </w:p>
+        </w:tc>
+        <w:tc>
+          <w:tcPr>
+            <w:tcW w:type="dxa" w:w="1072"/>
+            <w:shd w:val="clear" w:color="auto" w:fill="DCE6F1"/>
+          </w:tcPr>
+          <w:p>
+            <w:r>
+              <w:rPr>
+                <w:b w:val="0"/>
+                <w:sz w:val="16"/>
+              </w:rPr>
+              <w:t>10.16.0.0/24</w:t>
+            </w:r>
+          </w:p>
+        </w:tc>
+      </w:tr>
+      <w:tr>
+        <w:tc>
+          <w:tcPr>
+            <w:tcW w:type="dxa" w:w="1072"/>
+            <w:shd w:val="clear" w:color="auto" w:fill="FFFFFF"/>
+          </w:tcPr>
+          <w:p>
+            <w:r>
+              <w:rPr>
+                <w:b w:val="0"/>
+                <w:sz w:val="16"/>
+              </w:rPr>
+              <w:t>180</w:t>
+            </w:r>
+          </w:p>
+        </w:tc>
+        <w:tc>
+          <w:tcPr>
+            <w:tcW w:type="dxa" w:w="1072"/>
+            <w:shd w:val="clear" w:color="auto" w:fill="FFFFFF"/>
+          </w:tcPr>
+          <w:p>
+            <w:r>
+              <w:rPr>
+                <w:b w:val="0"/>
+                <w:sz w:val="16"/>
+              </w:rPr>
+              <w:t>CorporateExt</w:t>
+            </w:r>
+          </w:p>
+        </w:tc>
+        <w:tc>
+          <w:tcPr>
+            <w:tcW w:type="dxa" w:w="1072"/>
+            <w:shd w:val="clear" w:color="auto" w:fill="FFFFFF"/>
+          </w:tcPr>
+          <w:p>
+            <w:r>
+              <w:rPr>
+                <w:b w:val="0"/>
+                <w:sz w:val="16"/>
+              </w:rPr>
+              <w:t>Overflow / gap</w:t>
+            </w:r>
+          </w:p>
+        </w:tc>
+        <w:tc>
+          <w:tcPr>
+            <w:tcW w:type="dxa" w:w="1072"/>
+            <w:shd w:val="clear" w:color="auto" w:fill="FFFFFF"/>
+          </w:tcPr>
+          <w:p>
+            <w:r>
+              <w:rPr>
+                <w:b w:val="0"/>
+                <w:sz w:val="16"/>
+              </w:rPr>
+              <w:t>10.11.180.0/24</w:t>
+            </w:r>
+          </w:p>
+        </w:tc>
+        <w:tc>
+          <w:tcPr>
+            <w:tcW w:type="dxa" w:w="1072"/>
+            <w:shd w:val="clear" w:color="auto" w:fill="FFFFFF"/>
+          </w:tcPr>
+          <w:p>
+            <w:r>
+              <w:rPr>
+                <w:b w:val="0"/>
+                <w:sz w:val="16"/>
+              </w:rPr>
+              <w:t>10.12.180.0/24</w:t>
+            </w:r>
+          </w:p>
+        </w:tc>
+        <w:tc>
+          <w:tcPr>
+            <w:tcW w:type="dxa" w:w="1072"/>
+            <w:shd w:val="clear" w:color="auto" w:fill="FFFFFF"/>
+          </w:tcPr>
+          <w:p>
+            <w:r>
+              <w:rPr>
+                <w:b w:val="0"/>
+                <w:sz w:val="16"/>
+              </w:rPr>
+              <w:t>10.13.180.0/24</w:t>
+            </w:r>
+          </w:p>
+        </w:tc>
+        <w:tc>
+          <w:tcPr>
+            <w:tcW w:type="dxa" w:w="1072"/>
+            <w:shd w:val="clear" w:color="auto" w:fill="FFFFFF"/>
+          </w:tcPr>
+          <w:p>
+            <w:r>
+              <w:rPr>
+                <w:b w:val="0"/>
+                <w:sz w:val="16"/>
+              </w:rPr>
+              <w:t>10.14.180.0/24</w:t>
+            </w:r>
+          </w:p>
+        </w:tc>
+        <w:tc>
+          <w:tcPr>
+            <w:tcW w:type="dxa" w:w="1072"/>
+            <w:shd w:val="clear" w:color="auto" w:fill="FFFFFF"/>
+          </w:tcPr>
+          <w:p>
+            <w:r>
+              <w:rPr>
+                <w:b w:val="0"/>
+                <w:sz w:val="16"/>
+              </w:rPr>
+              <w:t>10.15.180.0/24</w:t>
+            </w:r>
+          </w:p>
+        </w:tc>
+        <w:tc>
+          <w:tcPr>
+            <w:tcW w:type="dxa" w:w="1072"/>
+            <w:shd w:val="clear" w:color="auto" w:fill="FFFFFF"/>
+          </w:tcPr>
+          <w:p>
+            <w:r>
+              <w:rPr>
+                <w:b w:val="0"/>
+                <w:sz w:val="16"/>
               </w:rPr>
               <w:t>10.16.180.0/24</w:t>
             </w:r>
@@ -6284,7 +6785,7 @@
                 <w:rFonts w:ascii="Calibri" w:hAnsi="Calibri"/>
                 <w:sz w:val="18"/>
               </w:rPr>
-              <w:t>1,177</w:t>
+              <w:t>1,047</w:t>
             </w:r>
           </w:p>
         </w:tc>
@@ -6329,7 +6830,7 @@
                 <w:rFonts w:ascii="Calibri" w:hAnsi="Calibri"/>
                 <w:sz w:val="18"/>
               </w:rPr>
-              <w:t>Wireless clients</w:t>
+              <w:t>Wireless clients; IoT removed</w:t>
             </w:r>
           </w:p>
         </w:tc>
@@ -6359,7 +6860,7 @@
                 <w:rFonts w:ascii="Calibri" w:hAnsi="Calibri"/>
                 <w:sz w:val="18"/>
               </w:rPr>
-              <w:t>745</w:t>
+              <w:t>665</w:t>
             </w:r>
           </w:p>
         </w:tc>
@@ -6401,7 +6902,7 @@
                 <w:rFonts w:ascii="Calibri" w:hAnsi="Calibri"/>
                 <w:sz w:val="18"/>
               </w:rPr>
-              <w:t>Wireless clients; floor maps enabled — devices show 'Bangalore - 4th Floor' location format</w:t>
+              <w:t>Wireless clients; IoT removed</w:t>
             </w:r>
           </w:p>
         </w:tc>
@@ -6434,7 +6935,7 @@
                 <w:rFonts w:ascii="Calibri" w:hAnsi="Calibri"/>
                 <w:sz w:val="18"/>
               </w:rPr>
-              <w:t>30</w:t>
+              <w:t>39</w:t>
             </w:r>
           </w:p>
         </w:tc>
@@ -6479,7 +6980,7 @@
                 <w:rFonts w:ascii="Calibri" w:hAnsi="Calibri"/>
                 <w:sz w:val="18"/>
               </w:rPr>
-              <w:t>IoT + OT + clinical; VLAN scenario</w:t>
+              <w:t>Medical Devices; 9 on Guest VLAN scenario</w:t>
             </w:r>
           </w:p>
         </w:tc>

</xml_diff>